<commit_message>
Marilyn Monroe: Parte 3
Co-Authored-By: Claude Opus 5.5 <noreply@anthropic.com>
Claude-Session: https://claude.ai/code/session_01MJjUEEZrxQDEUifKK2vj9g
</commit_message>
<xml_diff>
--- a/roteiros/marilyn-monroe/MarilynMonroe_Parte3.docx
+++ b/roteiros/marilyn-monroe/MarilynMonroe_Parte3.docx
@@ -55,7 +55,15 @@
         <w:rPr>
           <w:color w:val="000000"/>
         </w:rPr>
-        <w:t>Hefner pediu demissão e decidiu lançar a própria revista. Uma revista masculina, mais ousada do que tudo o que existia nas bancas. O primeiro nome escolhido foi "Stag Party". Uma empresa com nome parecido reclamou, e ele trocou.</w:t>
+        <w:t>Tinha vinte e cinco anos e uma esposa grávida em casa. Mesmo assim, Hefner saiu da Esquire e ficou sem salário.</w:t>
+      </w:r>
+    </w:p>
+    <w:p>
+      <w:r>
+        <w:rPr>
+          <w:color w:val="000000"/>
+        </w:rPr>
+        <w:t>Decidiu lançar a própria revista. Uma revista masculina, mais ousada do que tudo o que existia nas bancas. O primeiro nome escolhido foi "Stag Party". Uma empresa com nome parecido reclamou, e ele trocou.</w:t>
       </w:r>
     </w:p>
     <w:p>

</xml_diff>

<commit_message>
Marilyn Monroe: revisão crítica da Parte 3
Co-Authored-By: Claude Opus 5.5 <noreply@anthropic.com>
Claude-Session: https://claude.ai/code/session_01MJjUEEZrxQDEUifKK2vj9g
</commit_message>
<xml_diff>
--- a/roteiros/marilyn-monroe/MarilynMonroe_Parte3.docx
+++ b/roteiros/marilyn-monroe/MarilynMonroe_Parte3.docx
@@ -39,7 +39,7 @@
         <w:rPr>
           <w:color w:val="000000"/>
         </w:rPr>
-        <w:t>Serviu no exército durante a guerra e depois estudou psicologia na universidade. Casou-se cedo, com uma colega de faculdade. Sonhava ser cartunista e chegou a publicar um livro de desenhos sobre Chicago, que quase ninguém comprou. Em mil novecentos e cinquenta e dois, trabalhava escrevendo textos de promoção para a revista Esquire, em Nova York e Chicago.</w:t>
+        <w:t>Serviu no exército durante a guerra e depois estudou psicologia na universidade. Casou-se cedo, com uma namorada dos tempos de escola. Sonhava ser cartunista e chegou a publicar um livro de desenhos sobre Chicago, que quase ninguém comprou. Em mil novecentos e cinquenta e um, trabalhava em Chicago escrevendo textos de promoção para a revista Esquire.</w:t>
       </w:r>
     </w:p>
     <w:p>
@@ -55,7 +55,7 @@
         <w:rPr>
           <w:color w:val="000000"/>
         </w:rPr>
-        <w:t>Tinha vinte e cinco anos e uma esposa grávida em casa. Mesmo assim, Hefner saiu da Esquire e ficou sem salário.</w:t>
+        <w:t>Tinha vinte e cinco anos e uma esposa em casa. Mesmo assim, Hefner saiu da Esquire.</w:t>
       </w:r>
     </w:p>
     <w:p>
@@ -175,7 +175,7 @@
         <w:rPr>
           <w:color w:val="C00000"/>
         </w:rPr>
-        <w:t>E o que Hefner fez com o nome de Marilyn não parou aí. Décadas depois, quando ela já estava morta, ele ia voltar a lucrar com ela de um jeito que muita gente considera ainda mais repugnante. Mas, naquele momento, Marilyn tinha outro problema. Estava prestes a se casar.</w:t>
+        <w:t>E o que Hefner fez com o nome de Marilyn não parou aí. Décadas depois, quando ela já estava morta, ele ia tomar uma decisão envolvendo Marilyn que muita gente considera ainda mais repugnante. Mas, naquele momento, Marilyn tinha outro problema. Estava prestes a se casar.</w:t>
       </w:r>
     </w:p>
     <w:p>
@@ -647,7 +647,7 @@
         <w:rPr>
           <w:color w:val="1F4EB4"/>
         </w:rPr>
-        <w:t>Marilyn pegou uma cadeira e quebrou o vidro da porta. Segundo ela mesma contou depois, só fez isso para chamar atenção e conseguir ajuda.</w:t>
+        <w:t>Marilyn pegou uma cadeira e quebrou o vidro da porta. Numa carta escrita dias depois, ela explicou o gesto com uma frase: "Se vocês vão me tratar como louca, eu vou agir como louca."</w:t>
       </w:r>
     </w:p>
     <w:p>

</xml_diff>